<commit_message>
docs: update pom project, document microservice, add git-commit-convention
</commit_message>
<xml_diff>
--- a/NoteUber.docx
+++ b/NoteUber.docx
@@ -2,6 +2,278 @@
 <file path=word/document.xml><?xml version="1.0" encoding="utf-8"?>
 <w:document xmlns:wpc="http://schemas.microsoft.com/office/word/2010/wordprocessingCanvas" xmlns:cx="http://schemas.microsoft.com/office/drawing/2014/chartex" xmlns:cx1="http://schemas.microsoft.com/office/drawing/2015/9/8/chartex" xmlns:mc="http://schemas.openxmlformats.org/markup-compatibility/2006" xmlns:o="urn:schemas-microsoft-com:office:office" xmlns:r="http://schemas.openxmlformats.org/officeDocument/2006/relationships" xmlns:m="http://schemas.openxmlformats.org/officeDocument/2006/math" xmlns:v="urn:schemas-microsoft-com:vml" xmlns:wp14="http://schemas.microsoft.com/office/word/2010/wordprocessingDrawing" xmlns:wp="http://schemas.openxmlformats.org/drawingml/2006/wordprocessingDrawing" xmlns:w10="urn:schemas-microsoft-com:office:word" xmlns:w="http://schemas.openxmlformats.org/wordprocessingml/2006/main" xmlns:w14="http://schemas.microsoft.com/office/word/2010/wordml" xmlns:w15="http://schemas.microsoft.com/office/word/2012/wordml" xmlns:w16se="http://schemas.microsoft.com/office/word/2015/wordml/symex" xmlns:wpg="http://schemas.microsoft.com/office/word/2010/wordprocessingGroup" xmlns:wpi="http://schemas.microsoft.com/office/word/2010/wordprocessingInk" xmlns:wne="http://schemas.microsoft.com/office/word/2006/wordml" xmlns:wps="http://schemas.microsoft.com/office/word/2010/wordprocessingShape" mc:Ignorable="w14 w15 w16se wp14">
   <w:body>
+    <w:p>
+      <w:r>
+        <w:rPr>
+          <w:noProof/>
+        </w:rPr>
+        <mc:AlternateContent>
+          <mc:Choice Requires="wps">
+            <w:drawing>
+              <wp:inline distT="0" distB="0" distL="0" distR="0">
+                <wp:extent cx="304800" cy="304800"/>
+                <wp:effectExtent l="0" t="0" r="0" b="0"/>
+                <wp:docPr id="8" name="Rectangle 8" descr="blob:https://www.facebook.com/44d9f909-5e5c-41e9-ab4a-5c6273ad076d"/>
+                <wp:cNvGraphicFramePr>
+                  <a:graphicFrameLocks xmlns:a="http://schemas.openxmlformats.org/drawingml/2006/main" noChangeAspect="1"/>
+                </wp:cNvGraphicFramePr>
+                <a:graphic xmlns:a="http://schemas.openxmlformats.org/drawingml/2006/main">
+                  <a:graphicData uri="http://schemas.microsoft.com/office/word/2010/wordprocessingShape">
+                    <wps:wsp>
+                      <wps:cNvSpPr>
+                        <a:spLocks noChangeAspect="1" noChangeArrowheads="1"/>
+                      </wps:cNvSpPr>
+                      <wps:spPr bwMode="auto">
+                        <a:xfrm>
+                          <a:off x="0" y="0"/>
+                          <a:ext cx="304800" cy="304800"/>
+                        </a:xfrm>
+                        <a:prstGeom prst="rect">
+                          <a:avLst/>
+                        </a:prstGeom>
+                        <a:noFill/>
+                        <a:ln>
+                          <a:noFill/>
+                        </a:ln>
+                        <a:extLst>
+                          <a:ext uri="{909E8E84-426E-40DD-AFC4-6F175D3DCCD1}">
+                            <a14:hiddenFill xmlns:a14="http://schemas.microsoft.com/office/drawing/2010/main">
+                              <a:solidFill>
+                                <a:srgbClr val="FFFFFF"/>
+                              </a:solidFill>
+                            </a14:hiddenFill>
+                          </a:ext>
+                          <a:ext uri="{91240B29-F687-4F45-9708-019B960494DF}">
+                            <a14:hiddenLine xmlns:a14="http://schemas.microsoft.com/office/drawing/2010/main" w="9525">
+                              <a:solidFill>
+                                <a:srgbClr val="000000"/>
+                              </a:solidFill>
+                              <a:miter lim="800000"/>
+                              <a:headEnd/>
+                              <a:tailEnd/>
+                            </a14:hiddenLine>
+                          </a:ext>
+                        </a:extLst>
+                      </wps:spPr>
+                      <wps:txbx>
+                        <w:txbxContent>
+                          <w:p>
+                            <w:pPr>
+                              <w:jc w:val="center"/>
+                            </w:pPr>
+                            <w:r>
+                              <w:rPr>
+                                <w:noProof/>
+                              </w:rPr>
+                              <mc:AlternateContent>
+                                <mc:Choice Requires="wps">
+                                  <w:drawing>
+                                    <wp:inline distT="0" distB="0" distL="0" distR="0">
+                                      <wp:extent cx="121920" cy="121920"/>
+                                      <wp:effectExtent l="0" t="0" r="0" b="0"/>
+                                      <wp:docPr id="9" name="Rectangle 9" descr="blob:https://www.facebook.com/44d9f909-5e5c-41e9-ab4a-5c6273ad076d"/>
+                                      <wp:cNvGraphicFramePr>
+                                        <a:graphicFrameLocks xmlns:a="http://schemas.openxmlformats.org/drawingml/2006/main" noChangeAspect="1"/>
+                                      </wp:cNvGraphicFramePr>
+                                      <a:graphic xmlns:a="http://schemas.openxmlformats.org/drawingml/2006/main">
+                                        <a:graphicData uri="http://schemas.microsoft.com/office/word/2010/wordprocessingShape">
+                                          <wps:wsp>
+                                            <wps:cNvSpPr>
+                                              <a:spLocks noChangeAspect="1" noChangeArrowheads="1"/>
+                                            </wps:cNvSpPr>
+                                            <wps:spPr bwMode="auto">
+                                              <a:xfrm>
+                                                <a:off x="0" y="0"/>
+                                                <a:ext cx="121920" cy="121920"/>
+                                              </a:xfrm>
+                                              <a:prstGeom prst="rect">
+                                                <a:avLst/>
+                                              </a:prstGeom>
+                                              <a:noFill/>
+                                              <a:ln>
+                                                <a:noFill/>
+                                              </a:ln>
+                                              <a:extLst>
+                                                <a:ext uri="{909E8E84-426E-40DD-AFC4-6F175D3DCCD1}">
+                                                  <a14:hiddenFill xmlns:a14="http://schemas.microsoft.com/office/drawing/2010/main">
+                                                    <a:solidFill>
+                                                      <a:srgbClr val="FFFFFF"/>
+                                                    </a:solidFill>
+                                                  </a14:hiddenFill>
+                                                </a:ext>
+                                                <a:ext uri="{91240B29-F687-4F45-9708-019B960494DF}">
+                                                  <a14:hiddenLine xmlns:a14="http://schemas.microsoft.com/office/drawing/2010/main" w="9525">
+                                                    <a:solidFill>
+                                                      <a:srgbClr val="000000"/>
+                                                    </a:solidFill>
+                                                    <a:miter lim="800000"/>
+                                                    <a:headEnd/>
+                                                    <a:tailEnd/>
+                                                  </a14:hiddenLine>
+                                                </a:ext>
+                                              </a:extLst>
+                                            </wps:spPr>
+                                            <wps:bodyPr rot="0" vert="horz" wrap="square" lIns="91440" tIns="45720" rIns="91440" bIns="45720" anchor="t" anchorCtr="0" upright="1">
+                                              <a:noAutofit/>
+                                            </wps:bodyPr>
+                                          </wps:wsp>
+                                        </a:graphicData>
+                                      </a:graphic>
+                                    </wp:inline>
+                                  </w:drawing>
+                                </mc:Choice>
+                                <mc:Fallback>
+                                  <w:pict>
+                                    <v:rect w14:anchorId="744C5F2F" id="Rectangle 9" o:spid="_x0000_s1026" alt="blob:https://www.facebook.com/44d9f909-5e5c-41e9-ab4a-5c6273ad076d" style="width:9.6pt;height:9.6pt;visibility:visible;mso-wrap-style:square;mso-left-percent:-10001;mso-top-percent:-10001;mso-position-horizontal:absolute;mso-position-horizontal-relative:char;mso-position-vertical:absolute;mso-position-vertical-relative:line;mso-left-percent:-10001;mso-top-percent:-10001;v-text-anchor:top" o:gfxdata="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" filled="f" stroked="f">
+                                      <o:lock v:ext="edit" aspectratio="t"/>
+                                      <w10:anchorlock/>
+                                    </v:rect>
+                                  </w:pict>
+                                </mc:Fallback>
+                              </mc:AlternateContent>
+                            </w:r>
+                          </w:p>
+                        </w:txbxContent>
+                      </wps:txbx>
+                      <wps:bodyPr rot="0" vert="horz" wrap="square" lIns="91440" tIns="45720" rIns="91440" bIns="45720" anchor="t" anchorCtr="0" upright="1">
+                        <a:noAutofit/>
+                      </wps:bodyPr>
+                    </wps:wsp>
+                  </a:graphicData>
+                </a:graphic>
+              </wp:inline>
+            </w:drawing>
+          </mc:Choice>
+          <mc:Fallback>
+            <w:pict>
+              <v:rect id="Rectangle 8" o:spid="_x0000_s1026" alt="blob:https://www.facebook.com/44d9f909-5e5c-41e9-ab4a-5c6273ad076d" style="width:24pt;height:24pt;visibility:visible;mso-wrap-style:square;mso-left-percent:-10001;mso-top-percent:-10001;mso-position-horizontal:absolute;mso-position-horizontal-relative:char;mso-position-vertical:absolute;mso-position-vertical-relative:line;mso-left-percent:-10001;mso-top-percent:-10001;v-text-anchor:top" o:gfxdata="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" filled="f" stroked="f">
+                <o:lock v:ext="edit" aspectratio="t"/>
+                <v:textbox>
+                  <w:txbxContent>
+                    <w:p>
+                      <w:pPr>
+                        <w:jc w:val="center"/>
+                      </w:pPr>
+                      <w:r>
+                        <w:rPr>
+                          <w:noProof/>
+                        </w:rPr>
+                        <mc:AlternateContent>
+                          <mc:Choice Requires="wps">
+                            <w:drawing>
+                              <wp:inline distT="0" distB="0" distL="0" distR="0">
+                                <wp:extent cx="121920" cy="121920"/>
+                                <wp:effectExtent l="0" t="0" r="0" b="0"/>
+                                <wp:docPr id="9" name="Rectangle 9" descr="blob:https://www.facebook.com/44d9f909-5e5c-41e9-ab4a-5c6273ad076d"/>
+                                <wp:cNvGraphicFramePr>
+                                  <a:graphicFrameLocks xmlns:a="http://schemas.openxmlformats.org/drawingml/2006/main" noChangeAspect="1"/>
+                                </wp:cNvGraphicFramePr>
+                                <a:graphic xmlns:a="http://schemas.openxmlformats.org/drawingml/2006/main">
+                                  <a:graphicData uri="http://schemas.microsoft.com/office/word/2010/wordprocessingShape">
+                                    <wps:wsp>
+                                      <wps:cNvSpPr>
+                                        <a:spLocks noChangeAspect="1" noChangeArrowheads="1"/>
+                                      </wps:cNvSpPr>
+                                      <wps:spPr bwMode="auto">
+                                        <a:xfrm>
+                                          <a:off x="0" y="0"/>
+                                          <a:ext cx="121920" cy="121920"/>
+                                        </a:xfrm>
+                                        <a:prstGeom prst="rect">
+                                          <a:avLst/>
+                                        </a:prstGeom>
+                                        <a:noFill/>
+                                        <a:ln>
+                                          <a:noFill/>
+                                        </a:ln>
+                                        <a:extLst>
+                                          <a:ext uri="{909E8E84-426E-40DD-AFC4-6F175D3DCCD1}">
+                                            <a14:hiddenFill xmlns:a14="http://schemas.microsoft.com/office/drawing/2010/main">
+                                              <a:solidFill>
+                                                <a:srgbClr val="FFFFFF"/>
+                                              </a:solidFill>
+                                            </a14:hiddenFill>
+                                          </a:ext>
+                                          <a:ext uri="{91240B29-F687-4F45-9708-019B960494DF}">
+                                            <a14:hiddenLine xmlns:a14="http://schemas.microsoft.com/office/drawing/2010/main" w="9525">
+                                              <a:solidFill>
+                                                <a:srgbClr val="000000"/>
+                                              </a:solidFill>
+                                              <a:miter lim="800000"/>
+                                              <a:headEnd/>
+                                              <a:tailEnd/>
+                                            </a14:hiddenLine>
+                                          </a:ext>
+                                        </a:extLst>
+                                      </wps:spPr>
+                                      <wps:bodyPr rot="0" vert="horz" wrap="square" lIns="91440" tIns="45720" rIns="91440" bIns="45720" anchor="t" anchorCtr="0" upright="1">
+                                        <a:noAutofit/>
+                                      </wps:bodyPr>
+                                    </wps:wsp>
+                                  </a:graphicData>
+                                </a:graphic>
+                              </wp:inline>
+                            </w:drawing>
+                          </mc:Choice>
+                          <mc:Fallback>
+                            <w:pict>
+                              <v:rect w14:anchorId="03260E31" id="Rectangle 9" o:spid="_x0000_s1026" alt="blob:https://www.facebook.com/44d9f909-5e5c-41e9-ab4a-5c6273ad076d" style="width:9.6pt;height:9.6pt;visibility:visible;mso-wrap-style:square;mso-left-percent:-10001;mso-top-percent:-10001;mso-position-horizontal:absolute;mso-position-horizontal-relative:char;mso-position-vertical:absolute;mso-position-vertical-relative:line;mso-left-percent:-10001;mso-top-percent:-10001;v-text-anchor:top" o:gfxdata="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" filled="f" stroked="f">
+                                <o:lock v:ext="edit" aspectratio="t"/>
+                                <w10:anchorlock/>
+                              </v:rect>
+                            </w:pict>
+                          </mc:Fallback>
+                        </mc:AlternateContent>
+                      </w:r>
+                    </w:p>
+                  </w:txbxContent>
+                </v:textbox>
+                <w10:anchorlock/>
+              </v:rect>
+            </w:pict>
+          </mc:Fallback>
+        </mc:AlternateContent>
+      </w:r>
+      <w:bookmarkStart w:id="0" w:name="_GoBack"/>
+      <w:r>
+        <w:drawing>
+          <wp:inline distT="0" distB="0" distL="0" distR="0" wp14:anchorId="747E4CB1" wp14:editId="07CD0106">
+            <wp:extent cx="5761990" cy="2896235"/>
+            <wp:effectExtent l="0" t="0" r="0" b="0"/>
+            <wp:docPr id="10" name="Picture 10"/>
+            <wp:cNvGraphicFramePr>
+              <a:graphicFrameLocks xmlns:a="http://schemas.openxmlformats.org/drawingml/2006/main" noChangeAspect="1"/>
+            </wp:cNvGraphicFramePr>
+            <a:graphic xmlns:a="http://schemas.openxmlformats.org/drawingml/2006/main">
+              <a:graphicData uri="http://schemas.openxmlformats.org/drawingml/2006/picture">
+                <pic:pic xmlns:pic="http://schemas.openxmlformats.org/drawingml/2006/picture">
+                  <pic:nvPicPr>
+                    <pic:cNvPr id="1" name=""/>
+                    <pic:cNvPicPr/>
+                  </pic:nvPicPr>
+                  <pic:blipFill>
+                    <a:blip r:embed="rId4"/>
+                    <a:stretch>
+                      <a:fillRect/>
+                    </a:stretch>
+                  </pic:blipFill>
+                  <pic:spPr>
+                    <a:xfrm>
+                      <a:off x="0" y="0"/>
+                      <a:ext cx="5761990" cy="2896235"/>
+                    </a:xfrm>
+                    <a:prstGeom prst="rect">
+                      <a:avLst/>
+                    </a:prstGeom>
+                  </pic:spPr>
+                </pic:pic>
+              </a:graphicData>
+            </a:graphic>
+          </wp:inline>
+        </w:drawing>
+      </w:r>
+      <w:bookmarkEnd w:id="0"/>
+    </w:p>
     <w:p>
       <w:r>
         <w:rPr>
@@ -23,7 +295,7 @@
                     <pic:cNvPicPr/>
                   </pic:nvPicPr>
                   <pic:blipFill>
-                    <a:blip r:embed="rId4"/>
+                    <a:blip r:embed="rId5"/>
                     <a:stretch>
                       <a:fillRect/>
                     </a:stretch>
@@ -44,6 +316,7 @@
         </w:drawing>
       </w:r>
     </w:p>
+    <w:p/>
     <w:p/>
     <w:p>
       <w:r>
@@ -66,7 +339,7 @@
                     <pic:cNvPicPr/>
                   </pic:nvPicPr>
                   <pic:blipFill>
-                    <a:blip r:embed="rId5"/>
+                    <a:blip r:embed="rId6"/>
                     <a:stretch>
                       <a:fillRect/>
                     </a:stretch>
@@ -110,7 +383,7 @@
                     <pic:cNvPicPr/>
                   </pic:nvPicPr>
                   <pic:blipFill>
-                    <a:blip r:embed="rId6"/>
+                    <a:blip r:embed="rId7"/>
                     <a:stretch>
                       <a:fillRect/>
                     </a:stretch>
@@ -165,7 +438,6 @@
       <w:r>
         <w:t>microservice</w:t>
       </w:r>
-      <w:bookmarkStart w:id="0" w:name="_GoBack"/>
       <w:proofErr w:type="spellEnd"/>
       <w:r>
         <w:t>(</w:t>
@@ -182,348 +454,286 @@
         <w:rPr>
           <w:rStyle w:val="Strong"/>
         </w:rPr>
-        <w:t>multi-module</w:t>
+        <w:t>multi-module)</w:t>
+      </w:r>
+    </w:p>
+    <w:p>
+      <w:proofErr w:type="gramStart"/>
+      <w:r>
+        <w:t>&lt;?xml</w:t>
+      </w:r>
+      <w:proofErr w:type="gramEnd"/>
+      <w:r>
+        <w:t xml:space="preserve"> version="1.0" encoding="UTF-8"?&gt;</w:t>
+      </w:r>
+    </w:p>
+    <w:p>
+      <w:r>
+        <w:t xml:space="preserve">&lt;project </w:t>
+      </w:r>
+      <w:proofErr w:type="spellStart"/>
+      <w:r>
+        <w:t>xmlns</w:t>
+      </w:r>
+      <w:proofErr w:type="spellEnd"/>
+      <w:r>
+        <w:t>="http://maven.apache.org/POM/4.0.0"</w:t>
+      </w:r>
+    </w:p>
+    <w:p>
+      <w:r>
+        <w:t xml:space="preserve">         </w:t>
+      </w:r>
+      <w:proofErr w:type="spellStart"/>
+      <w:r>
+        <w:t>xmlns:xsi</w:t>
+      </w:r>
+      <w:proofErr w:type="spellEnd"/>
+      <w:r>
+        <w:t>="http://www.w3.org/2001/XMLSchema-instance"</w:t>
+      </w:r>
+    </w:p>
+    <w:p>
+      <w:r>
+        <w:t xml:space="preserve">         </w:t>
+      </w:r>
+      <w:proofErr w:type="spellStart"/>
+      <w:r>
+        <w:t>xsi:schemaLocation</w:t>
+      </w:r>
+      <w:proofErr w:type="spellEnd"/>
+      <w:r>
+        <w:t>="http://maven.apache.org/POM/4.0.0 http://maven.apache.org/xsd/maven-4.0.0.xsd"&gt;</w:t>
+      </w:r>
+    </w:p>
+    <w:p>
+      <w:r>
+        <w:t xml:space="preserve">    &lt;</w:t>
+      </w:r>
+      <w:proofErr w:type="spellStart"/>
+      <w:r>
+        <w:t>modelVersion</w:t>
+      </w:r>
+      <w:proofErr w:type="spellEnd"/>
+      <w:r>
+        <w:t>&gt;4.0.0&lt;/</w:t>
+      </w:r>
+      <w:proofErr w:type="spellStart"/>
+      <w:r>
+        <w:t>modelVersion</w:t>
+      </w:r>
+      <w:proofErr w:type="spellEnd"/>
+      <w:r>
+        <w:t>&gt;</w:t>
+      </w:r>
+    </w:p>
+    <w:p/>
+    <w:p>
+      <w:r>
+        <w:t xml:space="preserve">    &lt;</w:t>
+      </w:r>
+      <w:proofErr w:type="spellStart"/>
+      <w:proofErr w:type="gramStart"/>
+      <w:r>
+        <w:t>groupId</w:t>
+      </w:r>
+      <w:proofErr w:type="spellEnd"/>
+      <w:r>
+        <w:t>&gt;</w:t>
+      </w:r>
+      <w:proofErr w:type="spellStart"/>
+      <w:proofErr w:type="gramEnd"/>
+      <w:r>
+        <w:t>com.rideshare</w:t>
+      </w:r>
+      <w:proofErr w:type="spellEnd"/>
+      <w:r>
+        <w:t>&lt;/</w:t>
+      </w:r>
+      <w:proofErr w:type="spellStart"/>
+      <w:r>
+        <w:t>groupId</w:t>
+      </w:r>
+      <w:proofErr w:type="spellEnd"/>
+      <w:r>
+        <w:t>&gt;</w:t>
+      </w:r>
+    </w:p>
+    <w:p>
+      <w:r>
+        <w:t xml:space="preserve">    &lt;</w:t>
+      </w:r>
+      <w:proofErr w:type="spellStart"/>
+      <w:proofErr w:type="gramStart"/>
+      <w:r>
+        <w:t>artifactId</w:t>
+      </w:r>
+      <w:proofErr w:type="spellEnd"/>
+      <w:r>
+        <w:t>&gt;</w:t>
+      </w:r>
+      <w:proofErr w:type="gramEnd"/>
+      <w:r>
+        <w:t>uber-app&lt;/</w:t>
+      </w:r>
+      <w:proofErr w:type="spellStart"/>
+      <w:r>
+        <w:t>artifactId</w:t>
+      </w:r>
+      <w:proofErr w:type="spellEnd"/>
+      <w:r>
+        <w:t>&gt;</w:t>
+      </w:r>
+    </w:p>
+    <w:p>
+      <w:r>
+        <w:t xml:space="preserve">    &lt;version&gt;1.0.0&lt;/version&gt;</w:t>
+      </w:r>
+    </w:p>
+    <w:p>
+      <w:r>
+        <w:t xml:space="preserve">    &lt;</w:t>
+      </w:r>
+      <w:proofErr w:type="gramStart"/>
+      <w:r>
+        <w:t>packaging&gt;</w:t>
+      </w:r>
+      <w:proofErr w:type="spellStart"/>
+      <w:proofErr w:type="gramEnd"/>
+      <w:r>
+        <w:t>pom</w:t>
+      </w:r>
+      <w:proofErr w:type="spellEnd"/>
+      <w:r>
+        <w:t>&lt;/packaging&gt;</w:t>
+      </w:r>
+    </w:p>
+    <w:p/>
+    <w:p>
+      <w:r>
+        <w:t xml:space="preserve">    &lt;</w:t>
+      </w:r>
+      <w:proofErr w:type="gramStart"/>
+      <w:r>
+        <w:t>modules</w:t>
+      </w:r>
+      <w:proofErr w:type="gramEnd"/>
+      <w:r>
+        <w:t>&gt;</w:t>
+      </w:r>
+    </w:p>
+    <w:p>
+      <w:r>
+        <w:t xml:space="preserve">        &lt;</w:t>
+      </w:r>
+      <w:proofErr w:type="gramStart"/>
+      <w:r>
+        <w:t>module&gt;</w:t>
+      </w:r>
+      <w:proofErr w:type="gramEnd"/>
+      <w:r>
+        <w:t>location-service&lt;/module&gt;</w:t>
+      </w:r>
+    </w:p>
+    <w:p>
+      <w:r>
+        <w:t xml:space="preserve">        &lt;</w:t>
+      </w:r>
+      <w:proofErr w:type="gramStart"/>
+      <w:r>
+        <w:t>module&gt;</w:t>
+      </w:r>
+      <w:proofErr w:type="gramEnd"/>
+      <w:r>
+        <w:t>matching-service&lt;/module&gt;</w:t>
+      </w:r>
+    </w:p>
+    <w:p>
+      <w:r>
+        <w:t xml:space="preserve">        &lt;</w:t>
+      </w:r>
+      <w:proofErr w:type="gramStart"/>
+      <w:r>
+        <w:t>module&gt;</w:t>
+      </w:r>
+      <w:proofErr w:type="gramEnd"/>
+      <w:r>
+        <w:t>ride-service&lt;/module&gt;</w:t>
+      </w:r>
+    </w:p>
+    <w:p>
+      <w:r>
+        <w:t xml:space="preserve">    &lt;/modules&gt;</w:t>
+      </w:r>
+    </w:p>
+    <w:p/>
+    <w:p>
+      <w:r>
+        <w:t xml:space="preserve">    &lt;</w:t>
+      </w:r>
+      <w:proofErr w:type="gramStart"/>
+      <w:r>
+        <w:t>properties</w:t>
+      </w:r>
+      <w:proofErr w:type="gramEnd"/>
+      <w:r>
+        <w:t>&gt;</w:t>
+      </w:r>
+    </w:p>
+    <w:p>
+      <w:r>
+        <w:t xml:space="preserve">        &lt;</w:t>
+      </w:r>
+      <w:proofErr w:type="spellStart"/>
+      <w:r>
+        <w:t>java.version</w:t>
+      </w:r>
+      <w:proofErr w:type="spellEnd"/>
+      <w:r>
+        <w:t>&gt;17&lt;/</w:t>
+      </w:r>
+      <w:proofErr w:type="spellStart"/>
+      <w:r>
+        <w:t>java.version</w:t>
+      </w:r>
+      <w:proofErr w:type="spellEnd"/>
+      <w:r>
+        <w:t>&gt;</w:t>
+      </w:r>
+    </w:p>
+    <w:p>
+      <w:r>
+        <w:t xml:space="preserve">        &lt;project.build.sourceEncoding&gt;UTF-8&lt;/project.build.sourceEncoding&gt;</w:t>
+      </w:r>
+    </w:p>
+    <w:p>
+      <w:r>
+        <w:lastRenderedPageBreak/>
+        <w:t xml:space="preserve">    &lt;/properties&gt;</w:t>
+      </w:r>
+    </w:p>
+    <w:p>
+      <w:r>
+        <w:t>&lt;/project&gt;</w:t>
+      </w:r>
+      <w:r>
+        <w:br/>
+      </w:r>
+      <w:r>
+        <w:br/>
+      </w:r>
+      <w:r>
+        <w:br/>
       </w:r>
       <w:r>
         <w:rPr>
-          <w:rStyle w:val="Strong"/>
+          <w:noProof/>
         </w:rPr>
-        <w:t>)</w:t>
-      </w:r>
-    </w:p>
-    <w:bookmarkEnd w:id="0"/>
-    <w:p>
-      <w:proofErr w:type="gramStart"/>
-      <w:r>
-        <w:t>&lt;?xml</w:t>
-      </w:r>
-      <w:proofErr w:type="gramEnd"/>
-      <w:r>
-        <w:t xml:space="preserve"> version="1.0" encoding="UTF-8"?&gt;</w:t>
-      </w:r>
-    </w:p>
-    <w:p>
-      <w:r>
-        <w:lastRenderedPageBreak/>
-        <w:t xml:space="preserve">&lt;project </w:t>
-      </w:r>
-      <w:proofErr w:type="spellStart"/>
-      <w:r>
-        <w:t>xmlns</w:t>
-      </w:r>
-      <w:proofErr w:type="spellEnd"/>
-      <w:r>
-        <w:t>="http://maven.apache.org/POM/4.0.0"</w:t>
-      </w:r>
-    </w:p>
-    <w:p>
-      <w:r>
-        <w:t xml:space="preserve">         </w:t>
-      </w:r>
-      <w:proofErr w:type="spellStart"/>
-      <w:r>
-        <w:t>xmlns:xsi</w:t>
-      </w:r>
-      <w:proofErr w:type="spellEnd"/>
-      <w:r>
-        <w:t>="http://www.w3.org/2001/XMLSchema-instance"</w:t>
-      </w:r>
-    </w:p>
-    <w:p>
-      <w:r>
-        <w:t xml:space="preserve">         </w:t>
-      </w:r>
-      <w:proofErr w:type="spellStart"/>
-      <w:r>
-        <w:t>xsi:schemaLocation</w:t>
-      </w:r>
-      <w:proofErr w:type="spellEnd"/>
-      <w:r>
-        <w:t>="http://maven.apache.org/POM/4.0.0 http://maven.apache.org/xsd/maven-4.0.0.xsd"&gt;</w:t>
-      </w:r>
-    </w:p>
-    <w:p>
-      <w:r>
-        <w:t xml:space="preserve">    &lt;</w:t>
-      </w:r>
-      <w:proofErr w:type="spellStart"/>
-      <w:r>
-        <w:t>modelVersion</w:t>
-      </w:r>
-      <w:proofErr w:type="spellEnd"/>
-      <w:r>
-        <w:t>&gt;4.0.0&lt;/</w:t>
-      </w:r>
-      <w:proofErr w:type="spellStart"/>
-      <w:r>
-        <w:t>modelVersion</w:t>
-      </w:r>
-      <w:proofErr w:type="spellEnd"/>
-      <w:r>
-        <w:t>&gt;</w:t>
-      </w:r>
-    </w:p>
-    <w:p/>
-    <w:p>
-      <w:r>
-        <w:t xml:space="preserve">    &lt;</w:t>
-      </w:r>
-      <w:proofErr w:type="spellStart"/>
-      <w:proofErr w:type="gramStart"/>
-      <w:r>
-        <w:t>groupId</w:t>
-      </w:r>
-      <w:proofErr w:type="spellEnd"/>
-      <w:r>
-        <w:t>&gt;</w:t>
-      </w:r>
-      <w:proofErr w:type="spellStart"/>
-      <w:proofErr w:type="gramEnd"/>
-      <w:r>
-        <w:t>com.rideshare</w:t>
-      </w:r>
-      <w:proofErr w:type="spellEnd"/>
-      <w:r>
-        <w:t>&lt;/</w:t>
-      </w:r>
-      <w:proofErr w:type="spellStart"/>
-      <w:r>
-        <w:t>groupId</w:t>
-      </w:r>
-      <w:proofErr w:type="spellEnd"/>
-      <w:r>
-        <w:t>&gt;</w:t>
-      </w:r>
-    </w:p>
-    <w:p>
-      <w:r>
-        <w:t xml:space="preserve">    &lt;</w:t>
-      </w:r>
-      <w:proofErr w:type="spellStart"/>
-      <w:proofErr w:type="gramStart"/>
-      <w:r>
-        <w:t>artifactId</w:t>
-      </w:r>
-      <w:proofErr w:type="spellEnd"/>
-      <w:r>
-        <w:t>&gt;</w:t>
-      </w:r>
-      <w:proofErr w:type="gramEnd"/>
-      <w:r>
-        <w:t>uber-app&lt;/</w:t>
-      </w:r>
-      <w:proofErr w:type="spellStart"/>
-      <w:r>
-        <w:t>artifactId</w:t>
-      </w:r>
-      <w:proofErr w:type="spellEnd"/>
-      <w:r>
-        <w:t>&gt;</w:t>
-      </w:r>
-    </w:p>
-    <w:p>
-      <w:r>
-        <w:t xml:space="preserve">    &lt;version&gt;1.0.0&lt;/version&gt;</w:t>
-      </w:r>
-    </w:p>
-    <w:p>
-      <w:r>
-        <w:t xml:space="preserve">    &lt;</w:t>
-      </w:r>
-      <w:proofErr w:type="gramStart"/>
-      <w:r>
-        <w:t>packaging&gt;</w:t>
-      </w:r>
-      <w:proofErr w:type="spellStart"/>
-      <w:proofErr w:type="gramEnd"/>
-      <w:r>
-        <w:t>pom</w:t>
-      </w:r>
-      <w:proofErr w:type="spellEnd"/>
-      <w:r>
-        <w:t>&lt;/packaging&gt;</w:t>
-      </w:r>
-    </w:p>
-    <w:p/>
-    <w:p>
-      <w:r>
-        <w:t xml:space="preserve">    &lt;</w:t>
-      </w:r>
-      <w:proofErr w:type="gramStart"/>
-      <w:r>
-        <w:t>modules</w:t>
-      </w:r>
-      <w:proofErr w:type="gramEnd"/>
-      <w:r>
-        <w:t>&gt;</w:t>
-      </w:r>
-    </w:p>
-    <w:p>
-      <w:r>
-        <w:t xml:space="preserve">        &lt;</w:t>
-      </w:r>
-      <w:proofErr w:type="gramStart"/>
-      <w:r>
-        <w:t>module&gt;</w:t>
-      </w:r>
-      <w:proofErr w:type="gramEnd"/>
-      <w:r>
-        <w:t>location-service&lt;/module&gt;</w:t>
-      </w:r>
-    </w:p>
-    <w:p>
-      <w:r>
-        <w:t xml:space="preserve">        &lt;</w:t>
-      </w:r>
-      <w:proofErr w:type="gramStart"/>
-      <w:r>
-        <w:t>module&gt;</w:t>
-      </w:r>
-      <w:proofErr w:type="gramEnd"/>
-      <w:r>
-        <w:t>matching-service&lt;/module&gt;</w:t>
-      </w:r>
-    </w:p>
-    <w:p>
-      <w:r>
-        <w:t xml:space="preserve">        &lt;</w:t>
-      </w:r>
-      <w:proofErr w:type="gramStart"/>
-      <w:r>
-        <w:t>module&gt;</w:t>
-      </w:r>
-      <w:proofErr w:type="gramEnd"/>
-      <w:r>
-        <w:t>ride-service&lt;/module&gt;</w:t>
-      </w:r>
-    </w:p>
-    <w:p>
-      <w:r>
-        <w:t xml:space="preserve">    &lt;/modules&gt;</w:t>
-      </w:r>
-    </w:p>
-    <w:p/>
-    <w:p>
-      <w:r>
-        <w:t xml:space="preserve">    &lt;</w:t>
-      </w:r>
-      <w:proofErr w:type="gramStart"/>
-      <w:r>
-        <w:t>properties</w:t>
-      </w:r>
-      <w:proofErr w:type="gramEnd"/>
-      <w:r>
-        <w:t>&gt;</w:t>
-      </w:r>
-    </w:p>
-    <w:p>
-      <w:r>
-        <w:t xml:space="preserve">        &lt;</w:t>
-      </w:r>
-      <w:proofErr w:type="spellStart"/>
-      <w:r>
-        <w:t>java.version</w:t>
-      </w:r>
-      <w:proofErr w:type="spellEnd"/>
-      <w:r>
-        <w:t>&gt;17&lt;/</w:t>
-      </w:r>
-      <w:proofErr w:type="spellStart"/>
-      <w:r>
-        <w:t>java.version</w:t>
-      </w:r>
-      <w:proofErr w:type="spellEnd"/>
-      <w:r>
-        <w:t>&gt;</w:t>
-      </w:r>
-    </w:p>
-    <w:p>
-      <w:r>
-        <w:t xml:space="preserve">        &lt;project.build.sourceEncoding&gt;UTF-8&lt;/project.build.sourceEncoding&gt;</w:t>
-      </w:r>
-    </w:p>
-    <w:p>
-      <w:r>
-        <w:t xml:space="preserve">    &lt;/properties&gt;</w:t>
-      </w:r>
-    </w:p>
-    <w:p>
-      <w:r>
-        <w:t>&lt;/project&gt;</w:t>
-      </w:r>
-      <w:r>
-        <w:br/>
-      </w:r>
-      <w:r>
-        <w:br/>
-      </w:r>
-      <w:r>
-        <w:br/>
-      </w:r>
-      <w:r>
         <w:drawing>
           <wp:inline distT="0" distB="0" distL="0" distR="0" wp14:anchorId="706C5CE4" wp14:editId="618DA284">
             <wp:extent cx="5486875" cy="2042337"/>
             <wp:effectExtent l="0" t="0" r="0" b="0"/>
             <wp:docPr id="4" name="Picture 4"/>
-            <wp:cNvGraphicFramePr>
-              <a:graphicFrameLocks xmlns:a="http://schemas.openxmlformats.org/drawingml/2006/main" noChangeAspect="1"/>
-            </wp:cNvGraphicFramePr>
-            <a:graphic xmlns:a="http://schemas.openxmlformats.org/drawingml/2006/main">
-              <a:graphicData uri="http://schemas.openxmlformats.org/drawingml/2006/picture">
-                <pic:pic xmlns:pic="http://schemas.openxmlformats.org/drawingml/2006/picture">
-                  <pic:nvPicPr>
-                    <pic:cNvPr id="1" name=""/>
-                    <pic:cNvPicPr/>
-                  </pic:nvPicPr>
-                  <pic:blipFill>
-                    <a:blip r:embed="rId7"/>
-                    <a:stretch>
-                      <a:fillRect/>
-                    </a:stretch>
-                  </pic:blipFill>
-                  <pic:spPr>
-                    <a:xfrm>
-                      <a:off x="0" y="0"/>
-                      <a:ext cx="5486875" cy="2042337"/>
-                    </a:xfrm>
-                    <a:prstGeom prst="rect">
-                      <a:avLst/>
-                    </a:prstGeom>
-                  </pic:spPr>
-                </pic:pic>
-              </a:graphicData>
-            </a:graphic>
-          </wp:inline>
-        </w:drawing>
-      </w:r>
-    </w:p>
-    <w:p>
-      <w:proofErr w:type="spellStart"/>
-      <w:r>
-        <w:t>Thông</w:t>
-      </w:r>
-      <w:proofErr w:type="spellEnd"/>
-      <w:r>
-        <w:t xml:space="preserve"> tin </w:t>
-      </w:r>
-      <w:proofErr w:type="spellStart"/>
-      <w:r>
-        <w:t>về</w:t>
-      </w:r>
-      <w:proofErr w:type="spellEnd"/>
-      <w:r>
-        <w:t xml:space="preserve"> project</w:t>
-      </w:r>
-    </w:p>
-    <w:p>
-      <w:r>
-        <w:lastRenderedPageBreak/>
-        <w:drawing>
-          <wp:inline distT="0" distB="0" distL="0" distR="0" wp14:anchorId="238CD50F" wp14:editId="2114E77E">
-            <wp:extent cx="5761990" cy="1507490"/>
-            <wp:effectExtent l="0" t="0" r="0" b="0"/>
-            <wp:docPr id="5" name="Picture 5"/>
             <wp:cNvGraphicFramePr>
               <a:graphicFrameLocks xmlns:a="http://schemas.openxmlformats.org/drawingml/2006/main" noChangeAspect="1"/>
             </wp:cNvGraphicFramePr>
@@ -543,7 +753,7 @@
                   <pic:spPr>
                     <a:xfrm>
                       <a:off x="0" y="0"/>
-                      <a:ext cx="5761990" cy="1507490"/>
+                      <a:ext cx="5486875" cy="2042337"/>
                     </a:xfrm>
                     <a:prstGeom prst="rect">
                       <a:avLst/>
@@ -557,12 +767,33 @@
       </w:r>
     </w:p>
     <w:p>
-      <w:r>
+      <w:proofErr w:type="spellStart"/>
+      <w:r>
+        <w:t>Thông</w:t>
+      </w:r>
+      <w:proofErr w:type="spellEnd"/>
+      <w:r>
+        <w:t xml:space="preserve"> tin </w:t>
+      </w:r>
+      <w:proofErr w:type="spellStart"/>
+      <w:r>
+        <w:t>về</w:t>
+      </w:r>
+      <w:proofErr w:type="spellEnd"/>
+      <w:r>
+        <w:t xml:space="preserve"> project</w:t>
+      </w:r>
+    </w:p>
+    <w:p>
+      <w:r>
+        <w:rPr>
+          <w:noProof/>
+        </w:rPr>
         <w:drawing>
-          <wp:inline distT="0" distB="0" distL="0" distR="0" wp14:anchorId="0948C79A" wp14:editId="0891C7F4">
-            <wp:extent cx="5761990" cy="4704715"/>
-            <wp:effectExtent l="0" t="0" r="0" b="635"/>
-            <wp:docPr id="6" name="Picture 6"/>
+          <wp:inline distT="0" distB="0" distL="0" distR="0" wp14:anchorId="238CD50F" wp14:editId="2114E77E">
+            <wp:extent cx="5761990" cy="1507490"/>
+            <wp:effectExtent l="0" t="0" r="0" b="0"/>
+            <wp:docPr id="5" name="Picture 5"/>
             <wp:cNvGraphicFramePr>
               <a:graphicFrameLocks xmlns:a="http://schemas.openxmlformats.org/drawingml/2006/main" noChangeAspect="1"/>
             </wp:cNvGraphicFramePr>
@@ -582,6 +813,49 @@
                   <pic:spPr>
                     <a:xfrm>
                       <a:off x="0" y="0"/>
+                      <a:ext cx="5761990" cy="1507490"/>
+                    </a:xfrm>
+                    <a:prstGeom prst="rect">
+                      <a:avLst/>
+                    </a:prstGeom>
+                  </pic:spPr>
+                </pic:pic>
+              </a:graphicData>
+            </a:graphic>
+          </wp:inline>
+        </w:drawing>
+      </w:r>
+    </w:p>
+    <w:p>
+      <w:r>
+        <w:rPr>
+          <w:noProof/>
+        </w:rPr>
+        <w:lastRenderedPageBreak/>
+        <w:drawing>
+          <wp:inline distT="0" distB="0" distL="0" distR="0" wp14:anchorId="0948C79A" wp14:editId="0891C7F4">
+            <wp:extent cx="5761990" cy="4704715"/>
+            <wp:effectExtent l="0" t="0" r="0" b="635"/>
+            <wp:docPr id="6" name="Picture 6"/>
+            <wp:cNvGraphicFramePr>
+              <a:graphicFrameLocks xmlns:a="http://schemas.openxmlformats.org/drawingml/2006/main" noChangeAspect="1"/>
+            </wp:cNvGraphicFramePr>
+            <a:graphic xmlns:a="http://schemas.openxmlformats.org/drawingml/2006/main">
+              <a:graphicData uri="http://schemas.openxmlformats.org/drawingml/2006/picture">
+                <pic:pic xmlns:pic="http://schemas.openxmlformats.org/drawingml/2006/picture">
+                  <pic:nvPicPr>
+                    <pic:cNvPr id="1" name=""/>
+                    <pic:cNvPicPr/>
+                  </pic:nvPicPr>
+                  <pic:blipFill>
+                    <a:blip r:embed="rId10"/>
+                    <a:stretch>
+                      <a:fillRect/>
+                    </a:stretch>
+                  </pic:blipFill>
+                  <pic:spPr>
+                    <a:xfrm>
+                      <a:off x="0" y="0"/>
                       <a:ext cx="5761990" cy="4704715"/>
                     </a:xfrm>
                     <a:prstGeom prst="rect">
@@ -597,7 +871,9 @@
     </w:p>
     <w:p>
       <w:r>
-        <w:lastRenderedPageBreak/>
+        <w:rPr>
+          <w:noProof/>
+        </w:rPr>
         <w:drawing>
           <wp:inline distT="0" distB="0" distL="0" distR="0" wp14:anchorId="67FCBE3E" wp14:editId="1DA3D3CA">
             <wp:extent cx="5761990" cy="4010660"/>
@@ -614,7 +890,7 @@
                     <pic:cNvPicPr/>
                   </pic:nvPicPr>
                   <pic:blipFill>
-                    <a:blip r:embed="rId10"/>
+                    <a:blip r:embed="rId11"/>
                     <a:stretch>
                       <a:fillRect/>
                     </a:stretch>

</xml_diff>